<commit_message>
menambah dokumentasi pengembangan aplikasi
</commit_message>
<xml_diff>
--- a/docs/Project Execution.docx
+++ b/docs/Project Execution.docx
@@ -183,7 +183,7 @@
                           </pic:cNvPicPr>
                         </pic:nvPicPr>
                         <pic:blipFill>
-                          <a:blip r:embed="rId4" cstate="print">
+                          <a:blip r:embed="rId5" cstate="print">
                             <a:extLst>
                               <a:ext uri="{28A0092B-C50C-407E-A947-70E740481C1C}">
                                 <a14:useLocalDpi xmlns:a14="http://schemas.microsoft.com/office/drawing/2010/main" val="0"/>
@@ -280,6 +280,14 @@
               </w:rPr>
               <w:t xml:space="preserve"> Project Manager/Backend Developer</w:t>
             </w:r>
+            <w:r>
+              <w:rPr>
+                <w:rFonts w:ascii="Times New Roman" w:hAnsi="Times New Roman" w:cs="Times New Roman"/>
+                <w:sz w:val="24"/>
+                <w:szCs w:val="24"/>
+              </w:rPr>
+              <w:t xml:space="preserve">, </w:t>
+            </w:r>
           </w:p>
           <w:p>
             <w:pPr>
@@ -436,7 +444,7 @@
                           </pic:cNvPicPr>
                         </pic:nvPicPr>
                         <pic:blipFill>
-                          <a:blip r:embed="rId5" cstate="print">
+                          <a:blip r:embed="rId6" cstate="print">
                             <a:extLst>
                               <a:ext uri="{28A0092B-C50C-407E-A947-70E740481C1C}">
                                 <a14:useLocalDpi xmlns:a14="http://schemas.microsoft.com/office/drawing/2010/main" val="0"/>
@@ -601,16 +609,16 @@
                 <w:szCs w:val="24"/>
               </w:rPr>
               <w:drawing>
-                <wp:anchor distT="0" distB="0" distL="114300" distR="114300" simplePos="0" relativeHeight="251660288" behindDoc="1" locked="0" layoutInCell="1" allowOverlap="1" wp14:anchorId="22E37075" wp14:editId="06576CA4">
+                <wp:anchor distT="0" distB="0" distL="114300" distR="114300" simplePos="0" relativeHeight="251660288" behindDoc="1" locked="0" layoutInCell="1" allowOverlap="1" wp14:anchorId="22E37075" wp14:editId="2DD7833C">
                   <wp:simplePos x="0" y="0"/>
                   <wp:positionH relativeFrom="column">
-                    <wp:posOffset>106568</wp:posOffset>
+                    <wp:posOffset>105327</wp:posOffset>
                   </wp:positionH>
                   <wp:positionV relativeFrom="paragraph">
-                    <wp:posOffset>79118</wp:posOffset>
+                    <wp:posOffset>75399</wp:posOffset>
                   </wp:positionV>
-                  <wp:extent cx="1008991" cy="1794076"/>
-                  <wp:effectExtent l="0" t="0" r="1270" b="0"/>
+                  <wp:extent cx="1008060" cy="1565910"/>
+                  <wp:effectExtent l="0" t="0" r="1905" b="0"/>
                   <wp:wrapNone/>
                   <wp:docPr id="1313748907" name="Picture 3"/>
                   <wp:cNvGraphicFramePr>
@@ -621,193 +629,6 @@
                       <pic:pic xmlns:pic="http://schemas.openxmlformats.org/drawingml/2006/picture">
                         <pic:nvPicPr>
                           <pic:cNvPr id="0" name="Picture 5"/>
-                          <pic:cNvPicPr>
-                            <a:picLocks noChangeAspect="1" noChangeArrowheads="1"/>
-                          </pic:cNvPicPr>
-                        </pic:nvPicPr>
-                        <pic:blipFill>
-                          <a:blip r:embed="rId6" cstate="print">
-                            <a:extLst>
-                              <a:ext uri="{28A0092B-C50C-407E-A947-70E740481C1C}">
-                                <a14:useLocalDpi xmlns:a14="http://schemas.microsoft.com/office/drawing/2010/main" val="0"/>
-                              </a:ext>
-                            </a:extLst>
-                          </a:blip>
-                          <a:srcRect/>
-                          <a:stretch>
-                            <a:fillRect/>
-                          </a:stretch>
-                        </pic:blipFill>
-                        <pic:spPr bwMode="auto">
-                          <a:xfrm>
-                            <a:off x="0" y="0"/>
-                            <a:ext cx="1008991" cy="1794076"/>
-                          </a:xfrm>
-                          <a:prstGeom prst="rect">
-                            <a:avLst/>
-                          </a:prstGeom>
-                          <a:noFill/>
-                          <a:ln>
-                            <a:noFill/>
-                          </a:ln>
-                        </pic:spPr>
-                      </pic:pic>
-                    </a:graphicData>
-                  </a:graphic>
-                </wp:anchor>
-              </w:drawing>
-            </w:r>
-          </w:p>
-        </w:tc>
-        <w:tc>
-          <w:tcPr>
-            <w:tcW w:w="3595" w:type="pct"/>
-            <w:hideMark/>
-          </w:tcPr>
-          <w:p>
-            <w:pPr>
-              <w:spacing w:after="200"/>
-              <w:rPr>
-                <w:rFonts w:ascii="Times New Roman" w:hAnsi="Times New Roman" w:cs="Times New Roman"/>
-                <w:sz w:val="24"/>
-                <w:szCs w:val="24"/>
-                <w:lang w:val="sv-SE"/>
-              </w:rPr>
-            </w:pPr>
-            <w:r>
-              <w:rPr>
-                <w:rFonts w:ascii="Times New Roman" w:hAnsi="Times New Roman" w:cs="Times New Roman"/>
-                <w:sz w:val="24"/>
-                <w:szCs w:val="24"/>
-                <w:lang w:val="sv-SE"/>
-              </w:rPr>
-              <w:t>Nur Atikah Sebagai System Analyst / QA</w:t>
-            </w:r>
-          </w:p>
-          <w:p>
-            <w:pPr>
-              <w:spacing w:after="200"/>
-              <w:rPr>
-                <w:rFonts w:ascii="Times New Roman" w:hAnsi="Times New Roman" w:cs="Times New Roman"/>
-                <w:sz w:val="24"/>
-                <w:szCs w:val="24"/>
-                <w:lang w:val="sv-SE"/>
-              </w:rPr>
-            </w:pPr>
-          </w:p>
-          <w:p>
-            <w:pPr>
-              <w:spacing w:after="200"/>
-              <w:rPr>
-                <w:rFonts w:ascii="Times New Roman" w:hAnsi="Times New Roman" w:cs="Times New Roman"/>
-                <w:sz w:val="24"/>
-                <w:szCs w:val="24"/>
-                <w:lang w:val="sv-SE"/>
-              </w:rPr>
-            </w:pPr>
-          </w:p>
-          <w:p>
-            <w:pPr>
-              <w:spacing w:after="200"/>
-              <w:rPr>
-                <w:rFonts w:ascii="Times New Roman" w:hAnsi="Times New Roman" w:cs="Times New Roman"/>
-                <w:sz w:val="24"/>
-                <w:szCs w:val="24"/>
-                <w:lang w:val="sv-SE"/>
-              </w:rPr>
-            </w:pPr>
-          </w:p>
-          <w:p>
-            <w:pPr>
-              <w:spacing w:after="200"/>
-              <w:rPr>
-                <w:rFonts w:ascii="Times New Roman" w:hAnsi="Times New Roman" w:cs="Times New Roman"/>
-                <w:sz w:val="24"/>
-                <w:szCs w:val="24"/>
-                <w:lang w:val="sv-SE"/>
-              </w:rPr>
-            </w:pPr>
-          </w:p>
-          <w:p>
-            <w:pPr>
-              <w:spacing w:after="200"/>
-              <w:rPr>
-                <w:rFonts w:ascii="Times New Roman" w:hAnsi="Times New Roman" w:cs="Times New Roman"/>
-                <w:sz w:val="24"/>
-                <w:szCs w:val="24"/>
-                <w:lang w:val="sv-SE"/>
-              </w:rPr>
-            </w:pPr>
-          </w:p>
-        </w:tc>
-      </w:tr>
-      <w:tr>
-        <w:tc>
-          <w:tcPr>
-            <w:tcW w:w="207" w:type="pct"/>
-            <w:hideMark/>
-          </w:tcPr>
-          <w:p>
-            <w:pPr>
-              <w:spacing w:after="200"/>
-              <w:rPr>
-                <w:rFonts w:ascii="Times New Roman" w:hAnsi="Times New Roman" w:cs="Times New Roman"/>
-                <w:sz w:val="24"/>
-                <w:szCs w:val="24"/>
-              </w:rPr>
-            </w:pPr>
-            <w:r>
-              <w:rPr>
-                <w:rFonts w:ascii="Times New Roman" w:hAnsi="Times New Roman" w:cs="Times New Roman"/>
-                <w:sz w:val="24"/>
-                <w:szCs w:val="24"/>
-              </w:rPr>
-              <w:t>4</w:t>
-            </w:r>
-          </w:p>
-        </w:tc>
-        <w:tc>
-          <w:tcPr>
-            <w:tcW w:w="1198" w:type="pct"/>
-            <w:hideMark/>
-          </w:tcPr>
-          <w:p>
-            <w:pPr>
-              <w:spacing w:after="200"/>
-              <w:rPr>
-                <w:rFonts w:ascii="Times New Roman" w:hAnsi="Times New Roman" w:cs="Times New Roman"/>
-                <w:sz w:val="24"/>
-                <w:szCs w:val="24"/>
-              </w:rPr>
-            </w:pPr>
-            <w:r>
-              <w:rPr>
-                <w:rFonts w:ascii="Times New Roman" w:hAnsi="Times New Roman" w:cs="Times New Roman"/>
-                <w:noProof/>
-                <w:sz w:val="24"/>
-                <w:szCs w:val="24"/>
-              </w:rPr>
-              <w:drawing>
-                <wp:anchor distT="0" distB="0" distL="114300" distR="114300" simplePos="0" relativeHeight="251661312" behindDoc="1" locked="0" layoutInCell="1" allowOverlap="1" wp14:anchorId="1C9B357B" wp14:editId="6C1896A0">
-                  <wp:simplePos x="0" y="0"/>
-                  <wp:positionH relativeFrom="column">
-                    <wp:posOffset>130569</wp:posOffset>
-                  </wp:positionH>
-                  <wp:positionV relativeFrom="paragraph">
-                    <wp:posOffset>48911</wp:posOffset>
-                  </wp:positionV>
-                  <wp:extent cx="1024890" cy="1822348"/>
-                  <wp:effectExtent l="0" t="0" r="3810" b="6985"/>
-                  <wp:wrapNone/>
-                  <wp:docPr id="880466413" name="Picture 2"/>
-                  <wp:cNvGraphicFramePr>
-                    <a:graphicFrameLocks xmlns:a="http://schemas.openxmlformats.org/drawingml/2006/main" noChangeAspect="1"/>
-                  </wp:cNvGraphicFramePr>
-                  <a:graphic xmlns:a="http://schemas.openxmlformats.org/drawingml/2006/main">
-                    <a:graphicData uri="http://schemas.openxmlformats.org/drawingml/2006/picture">
-                      <pic:pic xmlns:pic="http://schemas.openxmlformats.org/drawingml/2006/picture">
-                        <pic:nvPicPr>
-                          <pic:cNvPr id="0" name="Picture 3"/>
                           <pic:cNvPicPr>
                             <a:picLocks noChangeAspect="1" noChangeArrowheads="1"/>
                           </pic:cNvPicPr>
@@ -828,7 +649,7 @@
                         <pic:spPr bwMode="auto">
                           <a:xfrm>
                             <a:off x="0" y="0"/>
-                            <a:ext cx="1024890" cy="1822348"/>
+                            <a:ext cx="1011385" cy="1571075"/>
                           </a:xfrm>
                           <a:prstGeom prst="rect">
                             <a:avLst/>
@@ -841,6 +662,9 @@
                       </pic:pic>
                     </a:graphicData>
                   </a:graphic>
+                  <wp14:sizeRelV relativeFrom="margin">
+                    <wp14:pctHeight>0</wp14:pctHeight>
+                  </wp14:sizeRelV>
                 </wp:anchor>
               </w:drawing>
             </w:r>
@@ -858,6 +682,7 @@
                 <w:rFonts w:ascii="Times New Roman" w:hAnsi="Times New Roman" w:cs="Times New Roman"/>
                 <w:sz w:val="24"/>
                 <w:szCs w:val="24"/>
+                <w:lang w:val="sv-SE"/>
               </w:rPr>
             </w:pPr>
             <w:r>
@@ -865,27 +690,10 @@
                 <w:rFonts w:ascii="Times New Roman" w:hAnsi="Times New Roman" w:cs="Times New Roman"/>
                 <w:sz w:val="24"/>
                 <w:szCs w:val="24"/>
-              </w:rPr>
-              <w:t xml:space="preserve">Mahesa Kayan </w:t>
+                <w:lang w:val="sv-SE"/>
+              </w:rPr>
+              <w:t>Nur Atikah Sebagai System Analyst / QA</w:t>
             </w:r>
-            <w:proofErr w:type="spellStart"/>
-            <w:r>
-              <w:rPr>
-                <w:rFonts w:ascii="Times New Roman" w:hAnsi="Times New Roman" w:cs="Times New Roman"/>
-                <w:sz w:val="24"/>
-                <w:szCs w:val="24"/>
-              </w:rPr>
-              <w:t>Sebagai</w:t>
-            </w:r>
-            <w:proofErr w:type="spellEnd"/>
-            <w:r>
-              <w:rPr>
-                <w:rFonts w:ascii="Times New Roman" w:hAnsi="Times New Roman" w:cs="Times New Roman"/>
-                <w:sz w:val="24"/>
-                <w:szCs w:val="24"/>
-              </w:rPr>
-              <w:t xml:space="preserve"> Database / Backend Developer</w:t>
-            </w:r>
           </w:p>
           <w:p>
             <w:pPr>
@@ -894,6 +702,7 @@
                 <w:rFonts w:ascii="Times New Roman" w:hAnsi="Times New Roman" w:cs="Times New Roman"/>
                 <w:sz w:val="24"/>
                 <w:szCs w:val="24"/>
+                <w:lang w:val="sv-SE"/>
               </w:rPr>
             </w:pPr>
           </w:p>
@@ -904,6 +713,7 @@
                 <w:rFonts w:ascii="Times New Roman" w:hAnsi="Times New Roman" w:cs="Times New Roman"/>
                 <w:sz w:val="24"/>
                 <w:szCs w:val="24"/>
+                <w:lang w:val="sv-SE"/>
               </w:rPr>
             </w:pPr>
           </w:p>
@@ -914,6 +724,7 @@
                 <w:rFonts w:ascii="Times New Roman" w:hAnsi="Times New Roman" w:cs="Times New Roman"/>
                 <w:sz w:val="24"/>
                 <w:szCs w:val="24"/>
+                <w:lang w:val="sv-SE"/>
               </w:rPr>
             </w:pPr>
           </w:p>
@@ -924,6 +735,7 @@
                 <w:rFonts w:ascii="Times New Roman" w:hAnsi="Times New Roman" w:cs="Times New Roman"/>
                 <w:sz w:val="24"/>
                 <w:szCs w:val="24"/>
+                <w:lang w:val="sv-SE"/>
               </w:rPr>
             </w:pPr>
           </w:p>
@@ -934,6 +746,7 @@
                 <w:rFonts w:ascii="Times New Roman" w:hAnsi="Times New Roman" w:cs="Times New Roman"/>
                 <w:sz w:val="24"/>
                 <w:szCs w:val="24"/>
+                <w:lang w:val="sv-SE"/>
               </w:rPr>
             </w:pPr>
           </w:p>
@@ -954,6 +767,14 @@
                 <w:szCs w:val="24"/>
               </w:rPr>
             </w:pPr>
+            <w:r>
+              <w:rPr>
+                <w:rFonts w:ascii="Times New Roman" w:hAnsi="Times New Roman" w:cs="Times New Roman"/>
+                <w:sz w:val="24"/>
+                <w:szCs w:val="24"/>
+              </w:rPr>
+              <w:t>4</w:t>
+            </w:r>
           </w:p>
         </w:tc>
         <w:tc>
@@ -964,12 +785,83 @@
           <w:p>
             <w:pPr>
               <w:spacing w:after="200"/>
-              <w:rPr>
-                <w:rFonts w:ascii="Times New Roman" w:hAnsi="Times New Roman" w:cs="Times New Roman"/>
-                <w:sz w:val="24"/>
-                <w:szCs w:val="24"/>
-              </w:rPr>
-            </w:pPr>
+              <w:ind w:hanging="59"/>
+              <w:rPr>
+                <w:rFonts w:ascii="Times New Roman" w:hAnsi="Times New Roman" w:cs="Times New Roman"/>
+                <w:sz w:val="24"/>
+                <w:szCs w:val="24"/>
+              </w:rPr>
+            </w:pPr>
+            <w:r>
+              <w:rPr>
+                <w:rFonts w:ascii="Times New Roman" w:hAnsi="Times New Roman" w:cs="Times New Roman"/>
+                <w:noProof/>
+                <w:sz w:val="24"/>
+                <w:szCs w:val="24"/>
+              </w:rPr>
+              <w:drawing>
+                <wp:anchor distT="0" distB="0" distL="114300" distR="114300" simplePos="0" relativeHeight="251661312" behindDoc="1" locked="0" layoutInCell="1" allowOverlap="1" wp14:anchorId="1C9B357B" wp14:editId="33A93A5A">
+                  <wp:simplePos x="0" y="0"/>
+                  <wp:positionH relativeFrom="column">
+                    <wp:posOffset>121229</wp:posOffset>
+                  </wp:positionH>
+                  <wp:positionV relativeFrom="paragraph">
+                    <wp:posOffset>49337</wp:posOffset>
+                  </wp:positionV>
+                  <wp:extent cx="1031799" cy="1533525"/>
+                  <wp:effectExtent l="0" t="0" r="0" b="0"/>
+                  <wp:wrapNone/>
+                  <wp:docPr id="880466413" name="Picture 2"/>
+                  <wp:cNvGraphicFramePr>
+                    <a:graphicFrameLocks xmlns:a="http://schemas.openxmlformats.org/drawingml/2006/main" noChangeAspect="1"/>
+                  </wp:cNvGraphicFramePr>
+                  <a:graphic xmlns:a="http://schemas.openxmlformats.org/drawingml/2006/main">
+                    <a:graphicData uri="http://schemas.openxmlformats.org/drawingml/2006/picture">
+                      <pic:pic xmlns:pic="http://schemas.openxmlformats.org/drawingml/2006/picture">
+                        <pic:nvPicPr>
+                          <pic:cNvPr id="0" name="Picture 3"/>
+                          <pic:cNvPicPr>
+                            <a:picLocks noChangeAspect="1" noChangeArrowheads="1"/>
+                          </pic:cNvPicPr>
+                        </pic:nvPicPr>
+                        <pic:blipFill>
+                          <a:blip r:embed="rId8" cstate="print">
+                            <a:extLst>
+                              <a:ext uri="{28A0092B-C50C-407E-A947-70E740481C1C}">
+                                <a14:useLocalDpi xmlns:a14="http://schemas.microsoft.com/office/drawing/2010/main" val="0"/>
+                              </a:ext>
+                            </a:extLst>
+                          </a:blip>
+                          <a:srcRect/>
+                          <a:stretch>
+                            <a:fillRect/>
+                          </a:stretch>
+                        </pic:blipFill>
+                        <pic:spPr bwMode="auto">
+                          <a:xfrm>
+                            <a:off x="0" y="0"/>
+                            <a:ext cx="1038139" cy="1542949"/>
+                          </a:xfrm>
+                          <a:prstGeom prst="rect">
+                            <a:avLst/>
+                          </a:prstGeom>
+                          <a:noFill/>
+                          <a:ln>
+                            <a:noFill/>
+                          </a:ln>
+                        </pic:spPr>
+                      </pic:pic>
+                    </a:graphicData>
+                  </a:graphic>
+                  <wp14:sizeRelH relativeFrom="margin">
+                    <wp14:pctWidth>0</wp14:pctWidth>
+                  </wp14:sizeRelH>
+                  <wp14:sizeRelV relativeFrom="margin">
+                    <wp14:pctHeight>0</wp14:pctHeight>
+                  </wp14:sizeRelV>
+                </wp:anchor>
+              </w:drawing>
+            </w:r>
           </w:p>
         </w:tc>
         <w:tc>
@@ -986,6 +878,132 @@
                 <w:szCs w:val="24"/>
               </w:rPr>
             </w:pPr>
+            <w:r>
+              <w:rPr>
+                <w:rFonts w:ascii="Times New Roman" w:hAnsi="Times New Roman" w:cs="Times New Roman"/>
+                <w:sz w:val="24"/>
+                <w:szCs w:val="24"/>
+              </w:rPr>
+              <w:t xml:space="preserve">Mahesa Kayan </w:t>
+            </w:r>
+            <w:proofErr w:type="spellStart"/>
+            <w:r>
+              <w:rPr>
+                <w:rFonts w:ascii="Times New Roman" w:hAnsi="Times New Roman" w:cs="Times New Roman"/>
+                <w:sz w:val="24"/>
+                <w:szCs w:val="24"/>
+              </w:rPr>
+              <w:t>Sebagai</w:t>
+            </w:r>
+            <w:proofErr w:type="spellEnd"/>
+            <w:r>
+              <w:rPr>
+                <w:rFonts w:ascii="Times New Roman" w:hAnsi="Times New Roman" w:cs="Times New Roman"/>
+                <w:sz w:val="24"/>
+                <w:szCs w:val="24"/>
+              </w:rPr>
+              <w:t xml:space="preserve"> Database / Backend Developer</w:t>
+            </w:r>
+          </w:p>
+          <w:p>
+            <w:pPr>
+              <w:spacing w:after="200"/>
+              <w:rPr>
+                <w:rFonts w:ascii="Times New Roman" w:hAnsi="Times New Roman" w:cs="Times New Roman"/>
+                <w:sz w:val="24"/>
+                <w:szCs w:val="24"/>
+              </w:rPr>
+            </w:pPr>
+          </w:p>
+          <w:p>
+            <w:pPr>
+              <w:spacing w:after="200"/>
+              <w:rPr>
+                <w:rFonts w:ascii="Times New Roman" w:hAnsi="Times New Roman" w:cs="Times New Roman"/>
+                <w:sz w:val="24"/>
+                <w:szCs w:val="24"/>
+              </w:rPr>
+            </w:pPr>
+          </w:p>
+          <w:p>
+            <w:pPr>
+              <w:spacing w:after="200"/>
+              <w:rPr>
+                <w:rFonts w:ascii="Times New Roman" w:hAnsi="Times New Roman" w:cs="Times New Roman"/>
+                <w:sz w:val="24"/>
+                <w:szCs w:val="24"/>
+              </w:rPr>
+            </w:pPr>
+          </w:p>
+          <w:p>
+            <w:pPr>
+              <w:spacing w:after="200"/>
+              <w:rPr>
+                <w:rFonts w:ascii="Times New Roman" w:hAnsi="Times New Roman" w:cs="Times New Roman"/>
+                <w:sz w:val="24"/>
+                <w:szCs w:val="24"/>
+              </w:rPr>
+            </w:pPr>
+          </w:p>
+          <w:p>
+            <w:pPr>
+              <w:spacing w:after="200"/>
+              <w:rPr>
+                <w:rFonts w:ascii="Times New Roman" w:hAnsi="Times New Roman" w:cs="Times New Roman"/>
+                <w:sz w:val="24"/>
+                <w:szCs w:val="24"/>
+              </w:rPr>
+            </w:pPr>
+          </w:p>
+        </w:tc>
+      </w:tr>
+      <w:tr>
+        <w:tc>
+          <w:tcPr>
+            <w:tcW w:w="207" w:type="pct"/>
+            <w:hideMark/>
+          </w:tcPr>
+          <w:p>
+            <w:pPr>
+              <w:spacing w:after="200"/>
+              <w:rPr>
+                <w:rFonts w:ascii="Times New Roman" w:hAnsi="Times New Roman" w:cs="Times New Roman"/>
+                <w:sz w:val="24"/>
+                <w:szCs w:val="24"/>
+              </w:rPr>
+            </w:pPr>
+          </w:p>
+        </w:tc>
+        <w:tc>
+          <w:tcPr>
+            <w:tcW w:w="1198" w:type="pct"/>
+            <w:hideMark/>
+          </w:tcPr>
+          <w:p>
+            <w:pPr>
+              <w:spacing w:after="200"/>
+              <w:rPr>
+                <w:rFonts w:ascii="Times New Roman" w:hAnsi="Times New Roman" w:cs="Times New Roman"/>
+                <w:sz w:val="24"/>
+                <w:szCs w:val="24"/>
+              </w:rPr>
+            </w:pPr>
+          </w:p>
+        </w:tc>
+        <w:tc>
+          <w:tcPr>
+            <w:tcW w:w="3595" w:type="pct"/>
+            <w:hideMark/>
+          </w:tcPr>
+          <w:p>
+            <w:pPr>
+              <w:spacing w:after="200"/>
+              <w:rPr>
+                <w:rFonts w:ascii="Times New Roman" w:hAnsi="Times New Roman" w:cs="Times New Roman"/>
+                <w:sz w:val="24"/>
+                <w:szCs w:val="24"/>
+              </w:rPr>
+            </w:pPr>
           </w:p>
         </w:tc>
       </w:tr>
@@ -996,6 +1014,667 @@
           <w:rFonts w:ascii="Times New Roman" w:hAnsi="Times New Roman" w:cs="Times New Roman"/>
           <w:sz w:val="24"/>
           <w:szCs w:val="24"/>
+        </w:rPr>
+      </w:pPr>
+    </w:p>
+    <w:p>
+      <w:pPr>
+        <w:rPr>
+          <w:rFonts w:ascii="Times New Roman" w:hAnsi="Times New Roman" w:cs="Times New Roman"/>
+          <w:sz w:val="24"/>
+          <w:szCs w:val="24"/>
+        </w:rPr>
+      </w:pPr>
+    </w:p>
+    <w:p>
+      <w:pPr>
+        <w:rPr>
+          <w:rFonts w:ascii="Times New Roman" w:hAnsi="Times New Roman" w:cs="Times New Roman"/>
+          <w:sz w:val="24"/>
+          <w:szCs w:val="24"/>
+        </w:rPr>
+      </w:pPr>
+    </w:p>
+    <w:p>
+      <w:pPr>
+        <w:rPr>
+          <w:rFonts w:ascii="Times New Roman" w:hAnsi="Times New Roman" w:cs="Times New Roman"/>
+          <w:sz w:val="24"/>
+          <w:szCs w:val="24"/>
+        </w:rPr>
+      </w:pPr>
+    </w:p>
+    <w:p>
+      <w:pPr>
+        <w:rPr>
+          <w:rFonts w:ascii="Times New Roman" w:hAnsi="Times New Roman" w:cs="Times New Roman"/>
+          <w:sz w:val="24"/>
+          <w:szCs w:val="24"/>
+        </w:rPr>
+      </w:pPr>
+    </w:p>
+    <w:p>
+      <w:pPr>
+        <w:spacing w:after="160"/>
+        <w:jc w:val="left"/>
+        <w:rPr>
+          <w:rFonts w:ascii="Times New Roman" w:hAnsi="Times New Roman" w:cs="Times New Roman"/>
+          <w:lang w:val="sv-SE"/>
+        </w:rPr>
+      </w:pPr>
+      <w:r>
+        <w:rPr>
+          <w:rFonts w:ascii="Times New Roman" w:hAnsi="Times New Roman" w:cs="Times New Roman"/>
+          <w:lang w:val="sv-SE"/>
+        </w:rPr>
+        <w:lastRenderedPageBreak/>
+        <w:t xml:space="preserve">Progres Pengembangan Aplikasi  Warung Mie Ayam Mastono </w:t>
+      </w:r>
+    </w:p>
+    <w:p>
+      <w:pPr>
+        <w:pStyle w:val="ListParagraph"/>
+        <w:numPr>
+          <w:ilvl w:val="0"/>
+          <w:numId w:val="1"/>
+        </w:numPr>
+        <w:spacing w:after="160"/>
+        <w:jc w:val="left"/>
+        <w:rPr>
+          <w:lang w:val="sv-SE"/>
+        </w:rPr>
+      </w:pPr>
+      <w:r>
+        <w:rPr>
+          <w:lang w:val="sv-SE"/>
+        </w:rPr>
+        <w:t>Tampilan Login</w:t>
+      </w:r>
+    </w:p>
+    <w:tbl>
+      <w:tblPr>
+        <w:tblStyle w:val="TableGrid"/>
+        <w:tblW w:w="5000" w:type="pct"/>
+        <w:tblBorders>
+          <w:top w:val="none" w:sz="0" w:space="0" w:color="auto"/>
+          <w:left w:val="none" w:sz="0" w:space="0" w:color="auto"/>
+          <w:bottom w:val="none" w:sz="0" w:space="0" w:color="auto"/>
+          <w:right w:val="none" w:sz="0" w:space="0" w:color="auto"/>
+          <w:insideH w:val="none" w:sz="0" w:space="0" w:color="auto"/>
+          <w:insideV w:val="none" w:sz="0" w:space="0" w:color="auto"/>
+        </w:tblBorders>
+        <w:tblLook w:val="04A0" w:firstRow="1" w:lastRow="0" w:firstColumn="1" w:lastColumn="0" w:noHBand="0" w:noVBand="1"/>
+      </w:tblPr>
+      <w:tblGrid>
+        <w:gridCol w:w="9026"/>
+      </w:tblGrid>
+      <w:tr>
+        <w:tc>
+          <w:tcPr>
+            <w:tcW w:w="5000" w:type="pct"/>
+          </w:tcPr>
+          <w:p>
+            <w:pPr>
+              <w:pStyle w:val="ListParagraph"/>
+              <w:spacing w:after="160"/>
+              <w:ind w:left="0"/>
+              <w:jc w:val="center"/>
+              <w:rPr>
+                <w:lang w:val="sv-SE"/>
+              </w:rPr>
+            </w:pPr>
+            <w:r>
+              <w:rPr>
+                <w:noProof/>
+                <w:lang w:val="sv-SE"/>
+              </w:rPr>
+              <w:drawing>
+                <wp:inline distT="0" distB="0" distL="0" distR="0" wp14:anchorId="3F486988" wp14:editId="58055C33">
+                  <wp:extent cx="4492321" cy="2665631"/>
+                  <wp:effectExtent l="0" t="0" r="3810" b="1905"/>
+                  <wp:docPr id="1508800702" name="Picture 1"/>
+                  <wp:cNvGraphicFramePr>
+                    <a:graphicFrameLocks xmlns:a="http://schemas.openxmlformats.org/drawingml/2006/main" noChangeAspect="1"/>
+                  </wp:cNvGraphicFramePr>
+                  <a:graphic xmlns:a="http://schemas.openxmlformats.org/drawingml/2006/main">
+                    <a:graphicData uri="http://schemas.openxmlformats.org/drawingml/2006/picture">
+                      <pic:pic xmlns:pic="http://schemas.openxmlformats.org/drawingml/2006/picture">
+                        <pic:nvPicPr>
+                          <pic:cNvPr id="1508800702" name="Picture 1508800702"/>
+                          <pic:cNvPicPr/>
+                        </pic:nvPicPr>
+                        <pic:blipFill rotWithShape="1">
+                          <a:blip r:embed="rId9" cstate="print">
+                            <a:extLst>
+                              <a:ext uri="{28A0092B-C50C-407E-A947-70E740481C1C}">
+                                <a14:useLocalDpi xmlns:a14="http://schemas.microsoft.com/office/drawing/2010/main" val="0"/>
+                              </a:ext>
+                            </a:extLst>
+                          </a:blip>
+                          <a:srcRect t="-903" b="-1"/>
+                          <a:stretch>
+                            <a:fillRect/>
+                          </a:stretch>
+                        </pic:blipFill>
+                        <pic:spPr bwMode="auto">
+                          <a:xfrm>
+                            <a:off x="0" y="0"/>
+                            <a:ext cx="4514591" cy="2678846"/>
+                          </a:xfrm>
+                          <a:prstGeom prst="rect">
+                            <a:avLst/>
+                          </a:prstGeom>
+                          <a:ln>
+                            <a:noFill/>
+                          </a:ln>
+                          <a:extLst>
+                            <a:ext uri="{53640926-AAD7-44D8-BBD7-CCE9431645EC}">
+                              <a14:shadowObscured xmlns:a14="http://schemas.microsoft.com/office/drawing/2010/main"/>
+                            </a:ext>
+                          </a:extLst>
+                        </pic:spPr>
+                      </pic:pic>
+                    </a:graphicData>
+                  </a:graphic>
+                </wp:inline>
+              </w:drawing>
+            </w:r>
+          </w:p>
+        </w:tc>
+      </w:tr>
+    </w:tbl>
+    <w:p>
+      <w:pPr>
+        <w:pStyle w:val="ListParagraph"/>
+        <w:spacing w:after="160"/>
+        <w:jc w:val="left"/>
+        <w:rPr>
+          <w:lang w:val="sv-SE"/>
+        </w:rPr>
+      </w:pPr>
+    </w:p>
+    <w:p>
+      <w:pPr>
+        <w:pStyle w:val="ListParagraph"/>
+        <w:numPr>
+          <w:ilvl w:val="0"/>
+          <w:numId w:val="1"/>
+        </w:numPr>
+        <w:spacing w:after="160"/>
+        <w:jc w:val="left"/>
+        <w:rPr>
+          <w:lang w:val="sv-SE"/>
+        </w:rPr>
+      </w:pPr>
+      <w:r>
+        <w:rPr>
+          <w:lang w:val="sv-SE"/>
+        </w:rPr>
+        <w:t>Dashboard</w:t>
+      </w:r>
+    </w:p>
+    <w:tbl>
+      <w:tblPr>
+        <w:tblStyle w:val="TableGrid"/>
+        <w:tblW w:w="5000" w:type="pct"/>
+        <w:tblBorders>
+          <w:top w:val="none" w:sz="0" w:space="0" w:color="auto"/>
+          <w:left w:val="none" w:sz="0" w:space="0" w:color="auto"/>
+          <w:bottom w:val="none" w:sz="0" w:space="0" w:color="auto"/>
+          <w:right w:val="none" w:sz="0" w:space="0" w:color="auto"/>
+          <w:insideH w:val="none" w:sz="0" w:space="0" w:color="auto"/>
+          <w:insideV w:val="none" w:sz="0" w:space="0" w:color="auto"/>
+        </w:tblBorders>
+        <w:tblLook w:val="04A0" w:firstRow="1" w:lastRow="0" w:firstColumn="1" w:lastColumn="0" w:noHBand="0" w:noVBand="1"/>
+      </w:tblPr>
+      <w:tblGrid>
+        <w:gridCol w:w="9026"/>
+      </w:tblGrid>
+      <w:tr>
+        <w:tc>
+          <w:tcPr>
+            <w:tcW w:w="5000" w:type="pct"/>
+          </w:tcPr>
+          <w:p>
+            <w:pPr>
+              <w:pStyle w:val="ListParagraph"/>
+              <w:spacing w:after="160"/>
+              <w:ind w:left="0"/>
+              <w:jc w:val="center"/>
+              <w:rPr>
+                <w:lang w:val="sv-SE"/>
+              </w:rPr>
+            </w:pPr>
+            <w:r>
+              <w:rPr>
+                <w:noProof/>
+                <w:lang w:val="sv-SE"/>
+              </w:rPr>
+              <w:drawing>
+                <wp:inline distT="0" distB="0" distL="0" distR="0" wp14:anchorId="3FA1937B" wp14:editId="34A3A183">
+                  <wp:extent cx="4452731" cy="2818130"/>
+                  <wp:effectExtent l="0" t="0" r="5080" b="1270"/>
+                  <wp:docPr id="1608658848" name="Picture 2"/>
+                  <wp:cNvGraphicFramePr>
+                    <a:graphicFrameLocks xmlns:a="http://schemas.openxmlformats.org/drawingml/2006/main" noChangeAspect="1"/>
+                  </wp:cNvGraphicFramePr>
+                  <a:graphic xmlns:a="http://schemas.openxmlformats.org/drawingml/2006/main">
+                    <a:graphicData uri="http://schemas.openxmlformats.org/drawingml/2006/picture">
+                      <pic:pic xmlns:pic="http://schemas.openxmlformats.org/drawingml/2006/picture">
+                        <pic:nvPicPr>
+                          <pic:cNvPr id="1608658848" name="Picture 1608658848"/>
+                          <pic:cNvPicPr/>
+                        </pic:nvPicPr>
+                        <pic:blipFill>
+                          <a:blip r:embed="rId10" cstate="print">
+                            <a:extLst>
+                              <a:ext uri="{28A0092B-C50C-407E-A947-70E740481C1C}">
+                                <a14:useLocalDpi xmlns:a14="http://schemas.microsoft.com/office/drawing/2010/main" val="0"/>
+                              </a:ext>
+                            </a:extLst>
+                          </a:blip>
+                          <a:stretch>
+                            <a:fillRect/>
+                          </a:stretch>
+                        </pic:blipFill>
+                        <pic:spPr>
+                          <a:xfrm>
+                            <a:off x="0" y="0"/>
+                            <a:ext cx="4453910" cy="2818876"/>
+                          </a:xfrm>
+                          <a:prstGeom prst="rect">
+                            <a:avLst/>
+                          </a:prstGeom>
+                        </pic:spPr>
+                      </pic:pic>
+                    </a:graphicData>
+                  </a:graphic>
+                </wp:inline>
+              </w:drawing>
+            </w:r>
+          </w:p>
+        </w:tc>
+      </w:tr>
+    </w:tbl>
+    <w:p>
+      <w:pPr>
+        <w:pStyle w:val="ListParagraph"/>
+        <w:spacing w:after="160"/>
+        <w:jc w:val="left"/>
+        <w:rPr>
+          <w:lang w:val="sv-SE"/>
+        </w:rPr>
+      </w:pPr>
+    </w:p>
+    <w:p>
+      <w:pPr>
+        <w:pStyle w:val="ListParagraph"/>
+        <w:spacing w:after="160"/>
+        <w:jc w:val="left"/>
+        <w:rPr>
+          <w:lang w:val="sv-SE"/>
+        </w:rPr>
+      </w:pPr>
+    </w:p>
+    <w:p>
+      <w:pPr>
+        <w:pStyle w:val="ListParagraph"/>
+        <w:spacing w:after="160"/>
+        <w:jc w:val="left"/>
+        <w:rPr>
+          <w:lang w:val="sv-SE"/>
+        </w:rPr>
+      </w:pPr>
+    </w:p>
+    <w:p>
+      <w:pPr>
+        <w:pStyle w:val="ListParagraph"/>
+        <w:spacing w:after="160"/>
+        <w:jc w:val="left"/>
+        <w:rPr>
+          <w:lang w:val="sv-SE"/>
+        </w:rPr>
+      </w:pPr>
+    </w:p>
+    <w:p>
+      <w:pPr>
+        <w:pStyle w:val="ListParagraph"/>
+        <w:spacing w:after="160"/>
+        <w:jc w:val="left"/>
+        <w:rPr>
+          <w:lang w:val="sv-SE"/>
+        </w:rPr>
+      </w:pPr>
+    </w:p>
+    <w:p>
+      <w:pPr>
+        <w:pStyle w:val="ListParagraph"/>
+        <w:spacing w:after="160"/>
+        <w:jc w:val="left"/>
+        <w:rPr>
+          <w:lang w:val="sv-SE"/>
+        </w:rPr>
+      </w:pPr>
+    </w:p>
+    <w:p>
+      <w:pPr>
+        <w:pStyle w:val="ListParagraph"/>
+        <w:spacing w:after="160"/>
+        <w:jc w:val="left"/>
+        <w:rPr>
+          <w:lang w:val="sv-SE"/>
+        </w:rPr>
+      </w:pPr>
+    </w:p>
+    <w:p>
+      <w:pPr>
+        <w:pStyle w:val="ListParagraph"/>
+        <w:spacing w:after="160"/>
+        <w:jc w:val="left"/>
+        <w:rPr>
+          <w:lang w:val="sv-SE"/>
+        </w:rPr>
+      </w:pPr>
+    </w:p>
+    <w:p>
+      <w:pPr>
+        <w:pStyle w:val="ListParagraph"/>
+        <w:spacing w:after="160"/>
+        <w:jc w:val="left"/>
+        <w:rPr>
+          <w:lang w:val="sv-SE"/>
+        </w:rPr>
+      </w:pPr>
+    </w:p>
+    <w:p>
+      <w:pPr>
+        <w:pStyle w:val="ListParagraph"/>
+        <w:spacing w:after="160"/>
+        <w:jc w:val="left"/>
+        <w:rPr>
+          <w:lang w:val="sv-SE"/>
+        </w:rPr>
+      </w:pPr>
+    </w:p>
+    <w:p>
+      <w:pPr>
+        <w:pStyle w:val="ListParagraph"/>
+        <w:spacing w:after="160"/>
+        <w:jc w:val="left"/>
+        <w:rPr>
+          <w:lang w:val="sv-SE"/>
+        </w:rPr>
+      </w:pPr>
+    </w:p>
+    <w:p>
+      <w:pPr>
+        <w:pStyle w:val="ListParagraph"/>
+        <w:numPr>
+          <w:ilvl w:val="0"/>
+          <w:numId w:val="1"/>
+        </w:numPr>
+        <w:spacing w:after="160"/>
+        <w:jc w:val="left"/>
+        <w:rPr>
+          <w:lang w:val="sv-SE"/>
+        </w:rPr>
+      </w:pPr>
+      <w:r>
+        <w:rPr>
+          <w:lang w:val="sv-SE"/>
+        </w:rPr>
+        <w:lastRenderedPageBreak/>
+        <w:t>Stok Masuk</w:t>
+      </w:r>
+    </w:p>
+    <w:tbl>
+      <w:tblPr>
+        <w:tblStyle w:val="TableGrid"/>
+        <w:tblW w:w="5000" w:type="pct"/>
+        <w:tblBorders>
+          <w:top w:val="none" w:sz="0" w:space="0" w:color="auto"/>
+          <w:left w:val="none" w:sz="0" w:space="0" w:color="auto"/>
+          <w:bottom w:val="none" w:sz="0" w:space="0" w:color="auto"/>
+          <w:right w:val="none" w:sz="0" w:space="0" w:color="auto"/>
+          <w:insideH w:val="none" w:sz="0" w:space="0" w:color="auto"/>
+          <w:insideV w:val="none" w:sz="0" w:space="0" w:color="auto"/>
+        </w:tblBorders>
+        <w:tblLook w:val="04A0" w:firstRow="1" w:lastRow="0" w:firstColumn="1" w:lastColumn="0" w:noHBand="0" w:noVBand="1"/>
+      </w:tblPr>
+      <w:tblGrid>
+        <w:gridCol w:w="9026"/>
+      </w:tblGrid>
+      <w:tr>
+        <w:tc>
+          <w:tcPr>
+            <w:tcW w:w="5000" w:type="pct"/>
+          </w:tcPr>
+          <w:p>
+            <w:pPr>
+              <w:pStyle w:val="ListParagraph"/>
+              <w:spacing w:after="160"/>
+              <w:ind w:left="0"/>
+              <w:jc w:val="center"/>
+              <w:rPr>
+                <w:lang w:val="sv-SE"/>
+              </w:rPr>
+            </w:pPr>
+            <w:r>
+              <w:rPr>
+                <w:noProof/>
+                <w:lang w:val="sv-SE"/>
+              </w:rPr>
+              <w:drawing>
+                <wp:inline distT="0" distB="0" distL="0" distR="0" wp14:anchorId="2C2E09B0" wp14:editId="7D36821B">
+                  <wp:extent cx="5009515" cy="2818130"/>
+                  <wp:effectExtent l="0" t="0" r="635" b="1270"/>
+                  <wp:docPr id="131173810" name="Picture 3"/>
+                  <wp:cNvGraphicFramePr>
+                    <a:graphicFrameLocks xmlns:a="http://schemas.openxmlformats.org/drawingml/2006/main" noChangeAspect="1"/>
+                  </wp:cNvGraphicFramePr>
+                  <a:graphic xmlns:a="http://schemas.openxmlformats.org/drawingml/2006/main">
+                    <a:graphicData uri="http://schemas.openxmlformats.org/drawingml/2006/picture">
+                      <pic:pic xmlns:pic="http://schemas.openxmlformats.org/drawingml/2006/picture">
+                        <pic:nvPicPr>
+                          <pic:cNvPr id="131173810" name="Picture 131173810"/>
+                          <pic:cNvPicPr/>
+                        </pic:nvPicPr>
+                        <pic:blipFill>
+                          <a:blip r:embed="rId11" cstate="print">
+                            <a:extLst>
+                              <a:ext uri="{28A0092B-C50C-407E-A947-70E740481C1C}">
+                                <a14:useLocalDpi xmlns:a14="http://schemas.microsoft.com/office/drawing/2010/main" val="0"/>
+                              </a:ext>
+                            </a:extLst>
+                          </a:blip>
+                          <a:stretch>
+                            <a:fillRect/>
+                          </a:stretch>
+                        </pic:blipFill>
+                        <pic:spPr>
+                          <a:xfrm>
+                            <a:off x="0" y="0"/>
+                            <a:ext cx="5009515" cy="2818130"/>
+                          </a:xfrm>
+                          <a:prstGeom prst="rect">
+                            <a:avLst/>
+                          </a:prstGeom>
+                        </pic:spPr>
+                      </pic:pic>
+                    </a:graphicData>
+                  </a:graphic>
+                </wp:inline>
+              </w:drawing>
+            </w:r>
+          </w:p>
+        </w:tc>
+      </w:tr>
+    </w:tbl>
+    <w:p>
+      <w:pPr>
+        <w:pStyle w:val="ListParagraph"/>
+        <w:spacing w:after="160"/>
+        <w:jc w:val="left"/>
+        <w:rPr>
+          <w:lang w:val="sv-SE"/>
+        </w:rPr>
+      </w:pPr>
+    </w:p>
+    <w:p>
+      <w:pPr>
+        <w:pStyle w:val="ListParagraph"/>
+        <w:numPr>
+          <w:ilvl w:val="0"/>
+          <w:numId w:val="1"/>
+        </w:numPr>
+        <w:spacing w:after="160"/>
+        <w:jc w:val="left"/>
+        <w:rPr>
+          <w:lang w:val="sv-SE"/>
+        </w:rPr>
+      </w:pPr>
+      <w:r>
+        <w:rPr>
+          <w:lang w:val="sv-SE"/>
+        </w:rPr>
+        <w:t>S</w:t>
+      </w:r>
+      <w:r>
+        <w:rPr>
+          <w:lang w:val="sv-SE"/>
+        </w:rPr>
+        <w:t xml:space="preserve">tok Keluar </w:t>
+      </w:r>
+    </w:p>
+    <w:tbl>
+      <w:tblPr>
+        <w:tblStyle w:val="TableGrid"/>
+        <w:tblW w:w="5000" w:type="pct"/>
+        <w:tblBorders>
+          <w:top w:val="none" w:sz="0" w:space="0" w:color="auto"/>
+          <w:left w:val="none" w:sz="0" w:space="0" w:color="auto"/>
+          <w:bottom w:val="none" w:sz="0" w:space="0" w:color="auto"/>
+          <w:right w:val="none" w:sz="0" w:space="0" w:color="auto"/>
+          <w:insideH w:val="none" w:sz="0" w:space="0" w:color="auto"/>
+          <w:insideV w:val="none" w:sz="0" w:space="0" w:color="auto"/>
+        </w:tblBorders>
+        <w:tblLook w:val="04A0" w:firstRow="1" w:lastRow="0" w:firstColumn="1" w:lastColumn="0" w:noHBand="0" w:noVBand="1"/>
+      </w:tblPr>
+      <w:tblGrid>
+        <w:gridCol w:w="9026"/>
+      </w:tblGrid>
+      <w:tr>
+        <w:tc>
+          <w:tcPr>
+            <w:tcW w:w="5000" w:type="pct"/>
+          </w:tcPr>
+          <w:p>
+            <w:pPr>
+              <w:pStyle w:val="ListParagraph"/>
+              <w:spacing w:after="160"/>
+              <w:ind w:left="0"/>
+              <w:jc w:val="center"/>
+              <w:rPr>
+                <w:lang w:val="sv-SE"/>
+              </w:rPr>
+            </w:pPr>
+            <w:r>
+              <w:rPr>
+                <w:noProof/>
+                <w:lang w:val="sv-SE"/>
+              </w:rPr>
+              <w:drawing>
+                <wp:inline distT="0" distB="0" distL="0" distR="0" wp14:anchorId="518C6F44" wp14:editId="2BCE8BD7">
+                  <wp:extent cx="5160396" cy="2817495"/>
+                  <wp:effectExtent l="0" t="0" r="2540" b="1905"/>
+                  <wp:docPr id="316443947" name="Picture 5"/>
+                  <wp:cNvGraphicFramePr>
+                    <a:graphicFrameLocks xmlns:a="http://schemas.openxmlformats.org/drawingml/2006/main" noChangeAspect="1"/>
+                  </wp:cNvGraphicFramePr>
+                  <a:graphic xmlns:a="http://schemas.openxmlformats.org/drawingml/2006/main">
+                    <a:graphicData uri="http://schemas.openxmlformats.org/drawingml/2006/picture">
+                      <pic:pic xmlns:pic="http://schemas.openxmlformats.org/drawingml/2006/picture">
+                        <pic:nvPicPr>
+                          <pic:cNvPr id="316443947" name="Picture 316443947"/>
+                          <pic:cNvPicPr/>
+                        </pic:nvPicPr>
+                        <pic:blipFill>
+                          <a:blip r:embed="rId12" cstate="print">
+                            <a:extLst>
+                              <a:ext uri="{28A0092B-C50C-407E-A947-70E740481C1C}">
+                                <a14:useLocalDpi xmlns:a14="http://schemas.microsoft.com/office/drawing/2010/main" val="0"/>
+                              </a:ext>
+                            </a:extLst>
+                          </a:blip>
+                          <a:stretch>
+                            <a:fillRect/>
+                          </a:stretch>
+                        </pic:blipFill>
+                        <pic:spPr>
+                          <a:xfrm>
+                            <a:off x="0" y="0"/>
+                            <a:ext cx="5170370" cy="2822941"/>
+                          </a:xfrm>
+                          <a:prstGeom prst="rect">
+                            <a:avLst/>
+                          </a:prstGeom>
+                        </pic:spPr>
+                      </pic:pic>
+                    </a:graphicData>
+                  </a:graphic>
+                </wp:inline>
+              </w:drawing>
+            </w:r>
+          </w:p>
+        </w:tc>
+      </w:tr>
+    </w:tbl>
+    <w:p>
+      <w:pPr>
+        <w:pStyle w:val="ListParagraph"/>
+        <w:spacing w:after="160"/>
+        <w:jc w:val="left"/>
+        <w:rPr>
+          <w:lang w:val="sv-SE"/>
+        </w:rPr>
+      </w:pPr>
+    </w:p>
+    <w:p>
+      <w:pPr>
+        <w:pStyle w:val="ListParagraph"/>
+        <w:rPr>
+          <w:rFonts w:ascii="Times New Roman" w:hAnsi="Times New Roman" w:cs="Times New Roman"/>
+          <w:lang w:val="sv-SE"/>
+        </w:rPr>
+      </w:pPr>
+      <w:r>
+        <w:rPr>
+          <w:rFonts w:ascii="Times New Roman" w:hAnsi="Times New Roman" w:cs="Times New Roman"/>
+          <w:lang w:val="sv-SE"/>
+        </w:rPr>
+        <w:t xml:space="preserve">Yang belum selesai  Status Stok, Riwayat Aktivitas, dan Laporan </w:t>
+      </w:r>
+    </w:p>
+    <w:p>
+      <w:pPr>
+        <w:pStyle w:val="ListParagraph"/>
+        <w:spacing w:after="160"/>
+        <w:jc w:val="left"/>
+        <w:rPr>
+          <w:rFonts w:ascii="Times New Roman" w:hAnsi="Times New Roman" w:cs="Times New Roman"/>
+          <w:sz w:val="24"/>
+          <w:szCs w:val="24"/>
+          <w:lang w:val="sv-SE"/>
+        </w:rPr>
+      </w:pPr>
+    </w:p>
+    <w:p>
+      <w:pPr>
+        <w:rPr>
+          <w:rFonts w:ascii="Times New Roman" w:hAnsi="Times New Roman" w:cs="Times New Roman"/>
+          <w:sz w:val="24"/>
+          <w:szCs w:val="24"/>
+          <w:lang w:val="sv-SE"/>
         </w:rPr>
       </w:pPr>
     </w:p>
@@ -1007,6 +1686,195 @@
     </w:sectPr>
   </w:body>
 </w:document>
+</file>
+
+<file path=word/numbering.xml><?xml version="1.0" encoding="utf-8"?>
+<w:numbering xmlns:wpc="http://schemas.microsoft.com/office/word/2010/wordprocessingCanvas" xmlns:cx="http://schemas.microsoft.com/office/drawing/2014/chartex" xmlns:cx1="http://schemas.microsoft.com/office/drawing/2015/9/8/chartex" xmlns:cx2="http://schemas.microsoft.com/office/drawing/2015/10/21/chartex" xmlns:cx3="http://schemas.microsoft.com/office/drawing/2016/5/9/chartex" xmlns:cx4="http://schemas.microsoft.com/office/drawing/2016/5/10/chartex" xmlns:cx5="http://schemas.microsoft.com/office/drawing/2016/5/11/chartex" xmlns:cx6="http://schemas.microsoft.com/office/drawing/2016/5/12/chartex" xmlns:cx7="http://schemas.microsoft.com/office/drawing/2016/5/13/chartex" xmlns:cx8="http://schemas.microsoft.com/office/drawing/2016/5/14/chartex" xmlns:mc="http://schemas.openxmlformats.org/markup-compatibility/2006" xmlns:aink="http://schemas.microsoft.com/office/drawing/2016/ink" xmlns:am3d="http://schemas.microsoft.com/office/drawing/2017/model3d" xmlns:o="urn:schemas-microsoft-com:office:office" xmlns:oel="http://schemas.microsoft.com/office/2019/extlst" xmlns:r="http://schemas.openxmlformats.org/officeDocument/2006/relationships" xmlns:m="http://schemas.openxmlformats.org/officeDocument/2006/math" xmlns:v="urn:schemas-microsoft-com:vml" xmlns:wp14="http://schemas.microsoft.com/office/word/2010/wordprocessingDrawing" xmlns:wp="http://schemas.openxmlformats.org/drawingml/2006/wordprocessingDrawing" xmlns:w10="urn:schemas-microsoft-com:office:word" xmlns:w="http://schemas.openxmlformats.org/wordprocessingml/2006/main" xmlns:w14="http://schemas.microsoft.com/office/word/2010/wordml" xmlns:w15="http://schemas.microsoft.com/office/word/2012/wordml" xmlns:w16cex="http://schemas.microsoft.com/office/word/2018/wordml/cex" xmlns:w16cid="http://schemas.microsoft.com/office/word/2016/wordml/cid" xmlns:w16="http://schemas.microsoft.com/office/word/2018/wordml" xmlns:w16du="http://schemas.microsoft.com/office/word/2023/wordml/word16du" xmlns:w16sdtdh="http://schemas.microsoft.com/office/word/2020/wordml/sdtdatahash" xmlns:w16sdtfl="http://schemas.microsoft.com/office/word/2024/wordml/sdtformatlock" xmlns:w16se="http://schemas.microsoft.com/office/word/2015/wordml/symex" xmlns:wpg="http://schemas.microsoft.com/office/word/2010/wordprocessingGroup" xmlns:wpi="http://schemas.microsoft.com/office/word/2010/wordprocessingInk" xmlns:wne="http://schemas.microsoft.com/office/word/2006/wordml" xmlns:wps="http://schemas.microsoft.com/office/word/2010/wordprocessingShape" mc:Ignorable="w14 w15 w16se w16cid w16 w16cex w16sdtdh w16sdtfl w16du wp14">
+  <w:abstractNum w:abstractNumId="0" w15:restartNumberingAfterBreak="0">
+    <w:nsid w:val="46142B8D"/>
+    <w:multiLevelType w:val="hybridMultilevel"/>
+    <w:tmpl w:val="A2C87250"/>
+    <w:lvl w:ilvl="0" w:tplc="0409000F">
+      <w:start w:val="1"/>
+      <w:numFmt w:val="decimal"/>
+      <w:lvlText w:val="%1."/>
+      <w:lvlJc w:val="left"/>
+      <w:pPr>
+        <w:ind w:left="720" w:hanging="360"/>
+      </w:pPr>
+      <w:rPr>
+        <w:rFonts w:hint="default"/>
+      </w:rPr>
+    </w:lvl>
+    <w:lvl w:ilvl="1" w:tplc="04090019" w:tentative="1">
+      <w:start w:val="1"/>
+      <w:numFmt w:val="lowerLetter"/>
+      <w:lvlText w:val="%2."/>
+      <w:lvlJc w:val="left"/>
+      <w:pPr>
+        <w:ind w:left="1440" w:hanging="360"/>
+      </w:pPr>
+    </w:lvl>
+    <w:lvl w:ilvl="2" w:tplc="0409001B" w:tentative="1">
+      <w:start w:val="1"/>
+      <w:numFmt w:val="lowerRoman"/>
+      <w:lvlText w:val="%3."/>
+      <w:lvlJc w:val="right"/>
+      <w:pPr>
+        <w:ind w:left="2160" w:hanging="180"/>
+      </w:pPr>
+    </w:lvl>
+    <w:lvl w:ilvl="3" w:tplc="0409000F" w:tentative="1">
+      <w:start w:val="1"/>
+      <w:numFmt w:val="decimal"/>
+      <w:lvlText w:val="%4."/>
+      <w:lvlJc w:val="left"/>
+      <w:pPr>
+        <w:ind w:left="2880" w:hanging="360"/>
+      </w:pPr>
+    </w:lvl>
+    <w:lvl w:ilvl="4" w:tplc="04090019" w:tentative="1">
+      <w:start w:val="1"/>
+      <w:numFmt w:val="lowerLetter"/>
+      <w:lvlText w:val="%5."/>
+      <w:lvlJc w:val="left"/>
+      <w:pPr>
+        <w:ind w:left="3600" w:hanging="360"/>
+      </w:pPr>
+    </w:lvl>
+    <w:lvl w:ilvl="5" w:tplc="0409001B" w:tentative="1">
+      <w:start w:val="1"/>
+      <w:numFmt w:val="lowerRoman"/>
+      <w:lvlText w:val="%6."/>
+      <w:lvlJc w:val="right"/>
+      <w:pPr>
+        <w:ind w:left="4320" w:hanging="180"/>
+      </w:pPr>
+    </w:lvl>
+    <w:lvl w:ilvl="6" w:tplc="0409000F" w:tentative="1">
+      <w:start w:val="1"/>
+      <w:numFmt w:val="decimal"/>
+      <w:lvlText w:val="%7."/>
+      <w:lvlJc w:val="left"/>
+      <w:pPr>
+        <w:ind w:left="5040" w:hanging="360"/>
+      </w:pPr>
+    </w:lvl>
+    <w:lvl w:ilvl="7" w:tplc="04090019" w:tentative="1">
+      <w:start w:val="1"/>
+      <w:numFmt w:val="lowerLetter"/>
+      <w:lvlText w:val="%8."/>
+      <w:lvlJc w:val="left"/>
+      <w:pPr>
+        <w:ind w:left="5760" w:hanging="360"/>
+      </w:pPr>
+    </w:lvl>
+    <w:lvl w:ilvl="8" w:tplc="0409001B" w:tentative="1">
+      <w:start w:val="1"/>
+      <w:numFmt w:val="lowerRoman"/>
+      <w:lvlText w:val="%9."/>
+      <w:lvlJc w:val="right"/>
+      <w:pPr>
+        <w:ind w:left="6480" w:hanging="180"/>
+      </w:pPr>
+    </w:lvl>
+  </w:abstractNum>
+  <w:abstractNum w:abstractNumId="1" w15:restartNumberingAfterBreak="0">
+    <w:nsid w:val="56E550FD"/>
+    <w:multiLevelType w:val="hybridMultilevel"/>
+    <w:tmpl w:val="9EE8AF64"/>
+    <w:lvl w:ilvl="0" w:tplc="0409000F">
+      <w:start w:val="1"/>
+      <w:numFmt w:val="decimal"/>
+      <w:lvlText w:val="%1."/>
+      <w:lvlJc w:val="left"/>
+      <w:pPr>
+        <w:ind w:left="720" w:hanging="360"/>
+      </w:pPr>
+      <w:rPr>
+        <w:rFonts w:hint="default"/>
+      </w:rPr>
+    </w:lvl>
+    <w:lvl w:ilvl="1" w:tplc="04090019" w:tentative="1">
+      <w:start w:val="1"/>
+      <w:numFmt w:val="lowerLetter"/>
+      <w:lvlText w:val="%2."/>
+      <w:lvlJc w:val="left"/>
+      <w:pPr>
+        <w:ind w:left="1440" w:hanging="360"/>
+      </w:pPr>
+    </w:lvl>
+    <w:lvl w:ilvl="2" w:tplc="0409001B" w:tentative="1">
+      <w:start w:val="1"/>
+      <w:numFmt w:val="lowerRoman"/>
+      <w:lvlText w:val="%3."/>
+      <w:lvlJc w:val="right"/>
+      <w:pPr>
+        <w:ind w:left="2160" w:hanging="180"/>
+      </w:pPr>
+    </w:lvl>
+    <w:lvl w:ilvl="3" w:tplc="0409000F" w:tentative="1">
+      <w:start w:val="1"/>
+      <w:numFmt w:val="decimal"/>
+      <w:lvlText w:val="%4."/>
+      <w:lvlJc w:val="left"/>
+      <w:pPr>
+        <w:ind w:left="2880" w:hanging="360"/>
+      </w:pPr>
+    </w:lvl>
+    <w:lvl w:ilvl="4" w:tplc="04090019" w:tentative="1">
+      <w:start w:val="1"/>
+      <w:numFmt w:val="lowerLetter"/>
+      <w:lvlText w:val="%5."/>
+      <w:lvlJc w:val="left"/>
+      <w:pPr>
+        <w:ind w:left="3600" w:hanging="360"/>
+      </w:pPr>
+    </w:lvl>
+    <w:lvl w:ilvl="5" w:tplc="0409001B" w:tentative="1">
+      <w:start w:val="1"/>
+      <w:numFmt w:val="lowerRoman"/>
+      <w:lvlText w:val="%6."/>
+      <w:lvlJc w:val="right"/>
+      <w:pPr>
+        <w:ind w:left="4320" w:hanging="180"/>
+      </w:pPr>
+    </w:lvl>
+    <w:lvl w:ilvl="6" w:tplc="0409000F" w:tentative="1">
+      <w:start w:val="1"/>
+      <w:numFmt w:val="decimal"/>
+      <w:lvlText w:val="%7."/>
+      <w:lvlJc w:val="left"/>
+      <w:pPr>
+        <w:ind w:left="5040" w:hanging="360"/>
+      </w:pPr>
+    </w:lvl>
+    <w:lvl w:ilvl="7" w:tplc="04090019" w:tentative="1">
+      <w:start w:val="1"/>
+      <w:numFmt w:val="lowerLetter"/>
+      <w:lvlText w:val="%8."/>
+      <w:lvlJc w:val="left"/>
+      <w:pPr>
+        <w:ind w:left="5760" w:hanging="360"/>
+      </w:pPr>
+    </w:lvl>
+    <w:lvl w:ilvl="8" w:tplc="0409001B" w:tentative="1">
+      <w:start w:val="1"/>
+      <w:numFmt w:val="lowerRoman"/>
+      <w:lvlText w:val="%9."/>
+      <w:lvlJc w:val="right"/>
+      <w:pPr>
+        <w:ind w:left="6480" w:hanging="180"/>
+      </w:pPr>
+    </w:lvl>
+  </w:abstractNum>
+  <w:num w:numId="1" w16cid:durableId="1007371293">
+    <w:abstractNumId w:val="0"/>
+  </w:num>
+  <w:num w:numId="2" w16cid:durableId="867258261">
+    <w:abstractNumId w:val="1"/>
+  </w:num>
+</w:numbering>
 </file>
 
 <file path=word/styles.xml><?xml version="1.0" encoding="utf-8"?>

</xml_diff>